<commit_message>
feat: expand seed dataset, include screenshots, and update project docs
</commit_message>
<xml_diff>
--- a/Hotel_Management_System_Project_Report.docx
+++ b/Hotel_Management_System_Project_Report.docx
@@ -5397,6 +5397,236 @@
       <w:pPr>
         <w:spacing w:before="0" w:after="160"/>
       </w:pPr>
+    </w:p>
+    <w:p>
+      <w:pPr>
+        <w:spacing w:before="240" w:after="240"/>
+        <w:pBdr>
+          <w:bottom w:val="single" w:sz="6" w:space="1" w:color="E2E8F0"/>
+        </w:pBdr>
+      </w:pPr>
+    </w:p>
+    <w:p>
+      <w:pPr>
+        <w:pStyle w:val="Heading3"/>
+        <w:keepNext/>
+        <w:spacing w:before="240" w:after="120"/>
+      </w:pPr>
+      <w:r>
+        <w:rPr>
+          <w:rFonts w:ascii="Segoe UI Semibold" w:hAnsi="Segoe UI Semibold"/>
+          <w:color w:val="2D3748"/>
+          <w:sz w:val="24"/>
+        </w:rPr>
+        <w:t>5.6 Database Seeding &amp; Mock Dataset</w:t>
+      </w:r>
+    </w:p>
+    <w:p>
+      <w:pPr>
+        <w:spacing w:before="0" w:after="160" w:line="276" w:lineRule="auto"/>
+      </w:pPr>
+      <w:r>
+        <w:rPr>
+          <w:rFonts w:ascii="Segoe UI" w:hAnsi="Segoe UI"/>
+          <w:sz w:val="22"/>
+        </w:rPr>
+        <w:t>To facilitate instant testing, demonstration, and validation, the project includes an automated database seed script (</w:t>
+      </w:r>
+      <w:r>
+        <w:rPr>
+          <w:rFonts w:ascii="Segoe UI" w:hAnsi="Segoe UI"/>
+          <w:color w:val="991B1B"/>
+          <w:sz w:val="22"/>
+        </w:rPr>
+        <w:t>src/seed.ts</w:t>
+      </w:r>
+      <w:r>
+        <w:rPr>
+          <w:rFonts w:ascii="Segoe UI" w:hAnsi="Segoe UI"/>
+          <w:sz w:val="22"/>
+        </w:rPr>
+        <w:t>). When run, it resets the database and creates a balanced, interconnected set of records representing hotel operations:</w:t>
+      </w:r>
+    </w:p>
+    <w:p>
+      <w:pPr>
+        <w:pStyle w:val="ListBullet"/>
+        <w:spacing w:before="0" w:after="60" w:line="276" w:lineRule="auto"/>
+      </w:pPr>
+      <w:r>
+        <w:rPr>
+          <w:rFonts w:ascii="Segoe UI" w:hAnsi="Segoe UI"/>
+          <w:sz w:val="22"/>
+        </w:rPr>
+      </w:r>
+      <w:r>
+        <w:rPr>
+          <w:rFonts w:ascii="Segoe UI" w:hAnsi="Segoe UI"/>
+          <w:b/>
+          <w:sz w:val="22"/>
+        </w:rPr>
+        <w:t>7 Departments</w:t>
+      </w:r>
+      <w:r>
+        <w:rPr>
+          <w:rFonts w:ascii="Segoe UI" w:hAnsi="Segoe UI"/>
+          <w:sz w:val="22"/>
+        </w:rPr>
+        <w:t>: Full coverage of hotel operations including Front Office, Housekeeping, Food &amp; Beverage, Security &amp; Safety, Maintenance &amp; IT, Sales &amp; Marketing, and Human Resources.</w:t>
+      </w:r>
+    </w:p>
+    <w:p>
+      <w:pPr>
+        <w:pStyle w:val="ListBullet"/>
+        <w:spacing w:before="0" w:after="60" w:line="276" w:lineRule="auto"/>
+      </w:pPr>
+      <w:r>
+        <w:rPr>
+          <w:rFonts w:ascii="Segoe UI" w:hAnsi="Segoe UI"/>
+          <w:sz w:val="22"/>
+        </w:rPr>
+      </w:r>
+      <w:r>
+        <w:rPr>
+          <w:rFonts w:ascii="Segoe UI" w:hAnsi="Segoe UI"/>
+          <w:b/>
+          <w:sz w:val="22"/>
+        </w:rPr>
+        <w:t>20 Rooms</w:t>
+      </w:r>
+      <w:r>
+        <w:rPr>
+          <w:rFonts w:ascii="Segoe UI" w:hAnsi="Segoe UI"/>
+          <w:sz w:val="22"/>
+        </w:rPr>
+        <w:t>: 6 Single, 6 Double, 5 Deluxe, and 3 Suite rooms distributed across statuses (</w:t>
+      </w:r>
+      <w:r>
+        <w:rPr>
+          <w:rFonts w:ascii="Segoe UI" w:hAnsi="Segoe UI"/>
+          <w:color w:val="991B1B"/>
+          <w:sz w:val="22"/>
+        </w:rPr>
+        <w:t>Available</w:t>
+      </w:r>
+      <w:r>
+        <w:rPr>
+          <w:rFonts w:ascii="Segoe UI" w:hAnsi="Segoe UI"/>
+          <w:sz w:val="22"/>
+        </w:rPr>
+        <w:t xml:space="preserve">, </w:t>
+      </w:r>
+      <w:r>
+        <w:rPr>
+          <w:rFonts w:ascii="Segoe UI" w:hAnsi="Segoe UI"/>
+          <w:color w:val="991B1B"/>
+          <w:sz w:val="22"/>
+        </w:rPr>
+        <w:t>Occupied</w:t>
+      </w:r>
+      <w:r>
+        <w:rPr>
+          <w:rFonts w:ascii="Segoe UI" w:hAnsi="Segoe UI"/>
+          <w:sz w:val="22"/>
+        </w:rPr>
+        <w:t xml:space="preserve">, </w:t>
+      </w:r>
+      <w:r>
+        <w:rPr>
+          <w:rFonts w:ascii="Segoe UI" w:hAnsi="Segoe UI"/>
+          <w:color w:val="991B1B"/>
+          <w:sz w:val="22"/>
+        </w:rPr>
+        <w:t>Maintenance</w:t>
+      </w:r>
+      <w:r>
+        <w:rPr>
+          <w:rFonts w:ascii="Segoe UI" w:hAnsi="Segoe UI"/>
+          <w:sz w:val="22"/>
+        </w:rPr>
+        <w:t>) to verify list filtering.</w:t>
+      </w:r>
+    </w:p>
+    <w:p>
+      <w:pPr>
+        <w:pStyle w:val="ListBullet"/>
+        <w:spacing w:before="0" w:after="60" w:line="276" w:lineRule="auto"/>
+      </w:pPr>
+      <w:r>
+        <w:rPr>
+          <w:rFonts w:ascii="Segoe UI" w:hAnsi="Segoe UI"/>
+          <w:sz w:val="22"/>
+        </w:rPr>
+      </w:r>
+      <w:r>
+        <w:rPr>
+          <w:rFonts w:ascii="Segoe UI" w:hAnsi="Segoe UI"/>
+          <w:b/>
+          <w:sz w:val="22"/>
+        </w:rPr>
+        <w:t>15 Customers</w:t>
+      </w:r>
+      <w:r>
+        <w:rPr>
+          <w:rFonts w:ascii="Segoe UI" w:hAnsi="Segoe UI"/>
+          <w:sz w:val="22"/>
+        </w:rPr>
+        <w:t>: Populated with realistic names, emails, and address fields matching the Zod schema requirements.</w:t>
+      </w:r>
+    </w:p>
+    <w:p>
+      <w:pPr>
+        <w:pStyle w:val="ListBullet"/>
+        <w:spacing w:before="0" w:after="60" w:line="276" w:lineRule="auto"/>
+      </w:pPr>
+      <w:r>
+        <w:rPr>
+          <w:rFonts w:ascii="Segoe UI" w:hAnsi="Segoe UI"/>
+          <w:sz w:val="22"/>
+        </w:rPr>
+      </w:r>
+      <w:r>
+        <w:rPr>
+          <w:rFonts w:ascii="Segoe UI" w:hAnsi="Segoe UI"/>
+          <w:b/>
+          <w:sz w:val="22"/>
+        </w:rPr>
+        <w:t>14 Staff Members</w:t>
+      </w:r>
+      <w:r>
+        <w:rPr>
+          <w:rFonts w:ascii="Segoe UI" w:hAnsi="Segoe UI"/>
+          <w:sz w:val="22"/>
+        </w:rPr>
+        <w:t>: 2 staff members assigned to each of the 7 departments to demonstrate staff directory population and department relationships.</w:t>
+      </w:r>
+    </w:p>
+    <w:p>
+      <w:pPr>
+        <w:pStyle w:val="ListBullet"/>
+        <w:spacing w:before="0" w:after="60" w:line="276" w:lineRule="auto"/>
+      </w:pPr>
+      <w:r>
+        <w:rPr>
+          <w:rFonts w:ascii="Segoe UI" w:hAnsi="Segoe UI"/>
+          <w:sz w:val="22"/>
+        </w:rPr>
+      </w:r>
+      <w:r>
+        <w:rPr>
+          <w:rFonts w:ascii="Segoe UI" w:hAnsi="Segoe UI"/>
+          <w:b/>
+          <w:sz w:val="22"/>
+        </w:rPr>
+        <w:t>12 Bookings</w:t>
+      </w:r>
+      <w:r>
+        <w:rPr>
+          <w:rFonts w:ascii="Segoe UI" w:hAnsi="Segoe UI"/>
+          <w:sz w:val="22"/>
+        </w:rPr>
+        <w:t>: Multi-status bookings (3 Booked, 3 CheckedIn, 3 CheckedOut, and 3 Cancelled) spanning past, present, and future dates to populate analytics dashboard metrics and charts.</w:t>
+      </w:r>
     </w:p>
     <w:p>
       <w:pPr>
@@ -15964,7 +16194,7 @@
                 <w:color w:val="991B1B"/>
                 <w:sz w:val="19"/>
               </w:rPr>
-              <w:t>npm run build</w:t>
+              <w:t>npm run seed</w:t>
             </w:r>
             <w:r>
               <w:rPr>
@@ -15992,21 +16222,7 @@
                 <w:rFonts w:ascii="Segoe UI" w:hAnsi="Segoe UI"/>
                 <w:sz w:val="19"/>
               </w:rPr>
-              <w:t xml:space="preserve">Compile TypeScript → </w:t>
-            </w:r>
-            <w:r>
-              <w:rPr>
-                <w:rFonts w:ascii="Segoe UI" w:hAnsi="Segoe UI"/>
-                <w:color w:val="991B1B"/>
-                <w:sz w:val="19"/>
-              </w:rPr>
-              <w:t>dist/</w:t>
-            </w:r>
-            <w:r>
-              <w:rPr>
-                <w:rFonts w:ascii="Segoe UI" w:hAnsi="Segoe UI"/>
-                <w:sz w:val="19"/>
-              </w:rPr>
+              <w:t>Seed database with 7 departments, 20 rooms, 15 customers, 14 staff, and 12 bookings</w:t>
             </w:r>
           </w:p>
         </w:tc>
@@ -16037,7 +16253,7 @@
                 <w:color w:val="991B1B"/>
                 <w:sz w:val="19"/>
               </w:rPr>
-              <w:t>npm start</w:t>
+              <w:t>npm run build</w:t>
             </w:r>
             <w:r>
               <w:rPr>
@@ -16065,7 +16281,7 @@
                 <w:rFonts w:ascii="Segoe UI" w:hAnsi="Segoe UI"/>
                 <w:sz w:val="19"/>
               </w:rPr>
-              <w:t>Run compiled production server (</w:t>
+              <w:t xml:space="preserve">Compile TypeScript → </w:t>
             </w:r>
             <w:r>
               <w:rPr>
@@ -16073,14 +16289,13 @@
                 <w:color w:val="991B1B"/>
                 <w:sz w:val="19"/>
               </w:rPr>
-              <w:t>node dist/server.js</w:t>
-            </w:r>
-            <w:r>
-              <w:rPr>
-                <w:rFonts w:ascii="Segoe UI" w:hAnsi="Segoe UI"/>
-                <w:sz w:val="19"/>
-              </w:rPr>
-              <w:t>)</w:t>
+              <w:t>dist/</w:t>
+            </w:r>
+            <w:r>
+              <w:rPr>
+                <w:rFonts w:ascii="Segoe UI" w:hAnsi="Segoe UI"/>
+                <w:sz w:val="19"/>
+              </w:rPr>
             </w:r>
           </w:p>
         </w:tc>
@@ -16111,7 +16326,7 @@
                 <w:color w:val="991B1B"/>
                 <w:sz w:val="19"/>
               </w:rPr>
-              <w:t>npm run clean</w:t>
+              <w:t>npm start</w:t>
             </w:r>
             <w:r>
               <w:rPr>
@@ -16125,6 +16340,80 @@
           <w:tcPr>
             <w:tcW w:type="dxa" w:w="4680"/>
             <w:shd w:fill="F7FAFC"/>
+            <w:tcMar>
+              <w:top w:w="100" w:type="dxa"/>
+              <w:bottom w:w="100" w:type="dxa"/>
+              <w:left w:w="140" w:type="dxa"/>
+              <w:right w:w="140" w:type="dxa"/>
+            </w:tcMar>
+          </w:tcPr>
+          <w:p>
+            <w:r/>
+            <w:r>
+              <w:rPr>
+                <w:rFonts w:ascii="Segoe UI" w:hAnsi="Segoe UI"/>
+                <w:sz w:val="19"/>
+              </w:rPr>
+              <w:t>Run compiled production server (</w:t>
+            </w:r>
+            <w:r>
+              <w:rPr>
+                <w:rFonts w:ascii="Segoe UI" w:hAnsi="Segoe UI"/>
+                <w:color w:val="991B1B"/>
+                <w:sz w:val="19"/>
+              </w:rPr>
+              <w:t>node dist/server.js</w:t>
+            </w:r>
+            <w:r>
+              <w:rPr>
+                <w:rFonts w:ascii="Segoe UI" w:hAnsi="Segoe UI"/>
+                <w:sz w:val="19"/>
+              </w:rPr>
+              <w:t>)</w:t>
+            </w:r>
+          </w:p>
+        </w:tc>
+      </w:tr>
+      <w:tr>
+        <w:tc>
+          <w:tcPr>
+            <w:tcW w:type="dxa" w:w="4680"/>
+            <w:shd w:fill="FFFFFF"/>
+            <w:tcMar>
+              <w:top w:w="100" w:type="dxa"/>
+              <w:bottom w:w="100" w:type="dxa"/>
+              <w:left w:w="140" w:type="dxa"/>
+              <w:right w:w="140" w:type="dxa"/>
+            </w:tcMar>
+          </w:tcPr>
+          <w:p>
+            <w:r/>
+            <w:r>
+              <w:rPr>
+                <w:rFonts w:ascii="Segoe UI" w:hAnsi="Segoe UI"/>
+                <w:sz w:val="19"/>
+              </w:rPr>
+            </w:r>
+            <w:r>
+              <w:rPr>
+                <w:rFonts w:ascii="Segoe UI" w:hAnsi="Segoe UI"/>
+                <w:color w:val="991B1B"/>
+                <w:sz w:val="19"/>
+              </w:rPr>
+              <w:t>npm run clean</w:t>
+            </w:r>
+            <w:r>
+              <w:rPr>
+                <w:rFonts w:ascii="Segoe UI" w:hAnsi="Segoe UI"/>
+                <w:sz w:val="19"/>
+              </w:rPr>
+            </w:r>
+          </w:p>
+        </w:tc>
+        <w:tc>
+          <w:tcPr>
+            <w:tcW w:type="dxa" w:w="4680"/>
+            <w:shd w:fill="FFFFFF"/>
             <w:tcMar>
               <w:top w:w="100" w:type="dxa"/>
               <w:bottom w:w="100" w:type="dxa"/>

</xml_diff>